<commit_message>
Added Datbase pooling and README.md
</commit_message>
<xml_diff>
--- a/Work_Log.docx
+++ b/Work_Log.docx
@@ -83,13 +83,15 @@
       <w:r>
         <w:t>8) Now inside backend directory creating a virual enviroment to keep project's dependencies seperate from system-wide python, so that</w:t>
       </w:r>
-    </w:p>
-    <w:p>
+      <w:r>
+        <w:t xml:space="preserve"> </w:t>
+      </w:r>
       <w:r>
         <w:t>our backend project can have its own pacakges and it also allows to prevent conflicts between projects, venv is created using command</w:t>
       </w:r>
-    </w:p>
-    <w:p>
+      <w:r>
+        <w:t xml:space="preserve"> </w:t>
+      </w:r>
       <w:r>
         <w:t>"python -m venv venv".</w:t>
       </w:r>
@@ -97,657 +99,659 @@
     <w:p/>
     <w:p>
       <w:r>
+        <w:t>9)  On Windows, use "venv\Scripts\activate"</w:t>
+      </w:r>
+    </w:p>
+    <w:p/>
+    <w:p>
+      <w:r>
         <w:lastRenderedPageBreak/>
-        <w:t>9)  On Windows, use "venv\Scripts\activate"</w:t>
+        <w:t>10) Installing Django's my sql client using "pip install django mysqlclient", also do pip install pymysql to use sql</w:t>
       </w:r>
     </w:p>
     <w:p/>
     <w:p>
       <w:r>
-        <w:t>10) Installing Django's my sql client using "pip install django mysqlclient", also do pip install pymysql to use sql</w:t>
+        <w:t>11) Starting the Django Project named Techmart inside backend using "django-admin startproject Techmart"</w:t>
       </w:r>
     </w:p>
     <w:p/>
     <w:p>
       <w:r>
-        <w:t>11) Starting the Django Project named Techmart inside backend using "django-admin startproject Techmart"</w:t>
+        <w:t>12) now go to command prompt and run "mysql -u root -p" -p flag asks password from the user, write your password to open MySQL command line interface,</w:t>
+      </w:r>
+    </w:p>
+    <w:p>
+      <w:r>
+        <w:t>and now create the database by "CREATE DATABASE techmart_db CHARACTER SET utf8mb4 COLLATE utf8mb4_unicode_ci;" (now ut-f 8 characters including emojis</w:t>
+      </w:r>
+    </w:p>
+    <w:p>
+      <w:r>
+        <w:t>and other special chacters), then create a new user who case use techmart_db with the command:</w:t>
+      </w:r>
+    </w:p>
+    <w:p>
+      <w:r>
+        <w:t>"CREATE USER 'techmart_user'@'localhost' IDENTIFIED BY 'PASSWORD';", change the password according to preference, then grant prvillages to this user with</w:t>
+      </w:r>
+    </w:p>
+    <w:p>
+      <w:r>
+        <w:t>"GRANT ALL PRIVILEGES ON techmart_db.* TO 'techmart_user'@'localhost';" and then apply the changes using "FLUSH PRIVILEGES". also see that that read_only</w:t>
+      </w:r>
+    </w:p>
+    <w:p>
+      <w:r>
+        <w:t>is set to off so that we can also write to this database, Write "SHOW VARIABLES LIKE 'read_only';", if read_only is set to off (in my case it was already on)</w:t>
+      </w:r>
+    </w:p>
+    <w:p>
+      <w:r>
+        <w:t>then you do "SET GLOBAL read_only = OFF;", do get write access as well for the new user. and now configure this DB in Django in the backend codebase</w:t>
       </w:r>
     </w:p>
     <w:p/>
     <w:p>
       <w:r>
-        <w:t>12) now go to command prompt and run "mysql -u root -p" -p flag asks password from the user, write your password to open MySQL command line interface,</w:t>
-      </w:r>
-    </w:p>
-    <w:p>
-      <w:r>
-        <w:t>and now create the database by "CREATE DATABASE techmart_db CHARACTER SET utf8mb4 COLLATE utf8mb4_unicode_ci;" (now ut-f 8 characters including emojis</w:t>
-      </w:r>
-    </w:p>
-    <w:p>
-      <w:r>
-        <w:t>and other special chacters), then create a new user who case use techmart_db with the command:</w:t>
-      </w:r>
-    </w:p>
-    <w:p>
-      <w:r>
-        <w:t>"CREATE USER 'techmart_user'@'localhost' IDENTIFIED BY 'PASSWORD';", change the password according to preference, then grant prvillages to this user with</w:t>
-      </w:r>
-    </w:p>
-    <w:p>
-      <w:r>
-        <w:t>"GRANT ALL PRIVILEGES ON techmart_db.* TO 'techmart_user'@'localhost';" and then apply the changes using "FLUSH PRIVILEGES". also see that that read_only</w:t>
-      </w:r>
-    </w:p>
-    <w:p>
-      <w:r>
-        <w:t>is set to off so that we can also write to this database, Write "SHOW VARIABLES LIKE 'read_only';", if read_only is set to off (in my case it was already on)</w:t>
-      </w:r>
-    </w:p>
-    <w:p>
-      <w:r>
-        <w:t>then you do "SET GLOBAL read_only = OFF;", do get write access as well for the new user. and now configure this DB in Django in the backend codebase</w:t>
+        <w:t>13) now in backend/Techmart/Techmart directory, go to settings.py, and find the json of Databases (in my case, started from line 76), and</w:t>
+      </w:r>
+    </w:p>
+    <w:p>
+      <w:r>
+        <w:t>then set the enviroment variables for MySQL in following manner</w:t>
+      </w:r>
+    </w:p>
+    <w:p>
+      <w:r>
+        <w:t>//Set variables accoding to your enviroment</w:t>
+      </w:r>
+    </w:p>
+    <w:p>
+      <w:r>
+        <w:t>//NOTE: "I HAVE USED ENVIROMENT VARIABLES LATER ON FOR EASE OF USE, USE THAT FOR CONVENICNCE, RATHER THAN SETTING VARIABLES HERE"</w:t>
+      </w:r>
+    </w:p>
+    <w:p>
+      <w:r>
+        <w:t>DATABASES = {</w:t>
+      </w:r>
+    </w:p>
+    <w:p>
+      <w:r>
+        <w:t>'default': {</w:t>
+      </w:r>
+    </w:p>
+    <w:p>
+      <w:r>
+        <w:t>'ENGINE': 'django.db.backends.mysql',</w:t>
+      </w:r>
+    </w:p>
+    <w:p>
+      <w:r>
+        <w:t>'NAME': 'techmart_db', //choose name according to your choice</w:t>
+      </w:r>
+    </w:p>
+    <w:p>
+      <w:r>
+        <w:lastRenderedPageBreak/>
+        <w:t>'USER': 'techmart_user', //write the name that</w:t>
+      </w:r>
+    </w:p>
+    <w:p>
+      <w:r>
+        <w:t>'PASSWORD': Enter you password here //</w:t>
+      </w:r>
+    </w:p>
+    <w:p>
+      <w:r>
+        <w:t>'HOST': 'localhost',</w:t>
+      </w:r>
+    </w:p>
+    <w:p>
+      <w:r>
+        <w:t>'PORT': '3306',</w:t>
+      </w:r>
+    </w:p>
+    <w:p>
+      <w:r>
+        <w:t>'OPTIONS': {</w:t>
+      </w:r>
+    </w:p>
+    <w:p>
+      <w:r>
+        <w:t>'init_command': "SET sql_mode='STRICT_TRANS_TABLES'",</w:t>
+      </w:r>
+    </w:p>
+    <w:p>
+      <w:r>
+        <w:t>},</w:t>
+      </w:r>
+    </w:p>
+    <w:p>
+      <w:r>
+        <w:t>}</w:t>
+      </w:r>
+    </w:p>
+    <w:p>
+      <w:r>
+        <w:t>}</w:t>
+      </w:r>
+    </w:p>
+    <w:p>
+      <w:r>
+        <w:t>Now mongodb runs perfectly locally, but towards the end of the project I would move to docerization if time limit is viable. But this technique is</w:t>
+      </w:r>
+    </w:p>
+    <w:p>
+      <w:r>
+        <w:t>enough to run MySQL locally, although it does require manual configuration</w:t>
       </w:r>
     </w:p>
     <w:p/>
     <w:p>
       <w:r>
-        <w:t>13) now in backend/Techmart/Techmart directory, go to settings.py, and find the json of Databases (in my case, started from line 76), and</w:t>
-      </w:r>
-    </w:p>
-    <w:p>
-      <w:r>
-        <w:t>then set the enviroment variables for MySQL in following manner</w:t>
-      </w:r>
-    </w:p>
-    <w:p>
-      <w:r>
-        <w:t>//Set variables accoding to your enviroment</w:t>
-      </w:r>
-    </w:p>
-    <w:p>
-      <w:r>
-        <w:t>//NOTE: "I HAVE USED ENVIROMENT VARIABLES LATER ON FOR EASE OF USE, USE THAT FOR CONVENICNCE, RATHER THAN SETTING VARIABLES HERE"</w:t>
-      </w:r>
-    </w:p>
-    <w:p>
-      <w:r>
-        <w:t>DATABASES = {</w:t>
-      </w:r>
-    </w:p>
-    <w:p>
-      <w:r>
-        <w:t>'default': {</w:t>
+        <w:t>14) Now I am adding the installed dependecies in requirements.txt.</w:t>
+      </w:r>
+    </w:p>
+    <w:p/>
+    <w:p>
+      <w:r>
+        <w:t>15) Create a requirements.txt using "pip freeze &gt; requirements.txt", this creates or overwrites the requirement.txt automatically,</w:t>
+      </w:r>
+    </w:p>
+    <w:p>
+      <w:r>
+        <w:t>adding the required python pacakges installed in current project enviroment (including versions) to requirements.txt</w:t>
+      </w:r>
+    </w:p>
+    <w:p/>
+    <w:p>
+      <w:r>
+        <w:t>16) now "deactivate" from the env so that we can push the current work in github, (I had created a repository beforehand)</w:t>
+      </w:r>
+    </w:p>
+    <w:p/>
+    <w:p>
+      <w:r>
+        <w:t>17) create a ".gitignore" so that venv, .env files, data, and similar files can be excluded from pushing into the git</w:t>
+      </w:r>
+    </w:p>
+    <w:p/>
+    <w:p>
+      <w:r>
+        <w:t>18) initialized git using "git init" and created a new branch named dev as "git checkout -b dev", then add by "git add .", commit, adding</w:t>
       </w:r>
     </w:p>
     <w:p>
       <w:r>
         <w:lastRenderedPageBreak/>
-        <w:t>'ENGINE': 'django.db.backends.mysql',</w:t>
-      </w:r>
-    </w:p>
-    <w:p>
-      <w:r>
-        <w:t>'NAME': 'techmart_db', //choose name according to your choice</w:t>
-      </w:r>
-    </w:p>
-    <w:p>
-      <w:r>
-        <w:t>'USER': 'techmart_user', //write the name that</w:t>
-      </w:r>
-    </w:p>
-    <w:p>
-      <w:r>
-        <w:t>'PASSWORD': Enter you password here //</w:t>
-      </w:r>
-    </w:p>
-    <w:p>
-      <w:r>
-        <w:t>'HOST': 'localhost',</w:t>
-      </w:r>
-    </w:p>
-    <w:p>
-      <w:r>
-        <w:t>'PORT': '3306',</w:t>
-      </w:r>
-    </w:p>
-    <w:p>
-      <w:r>
-        <w:t>'OPTIONS': {</w:t>
-      </w:r>
-    </w:p>
-    <w:p>
-      <w:r>
-        <w:t>'init_command': "SET sql_mode='STRICT_TRANS_TABLES'",</w:t>
-      </w:r>
-    </w:p>
-    <w:p>
-      <w:r>
-        <w:t>},</w:t>
-      </w:r>
-    </w:p>
-    <w:p>
-      <w:r>
-        <w:t>}</w:t>
-      </w:r>
-    </w:p>
-    <w:p>
-      <w:r>
-        <w:t>}</w:t>
-      </w:r>
-    </w:p>
-    <w:p>
-      <w:r>
-        <w:t>Now mongodb runs perfectly locally, but towards the end of the project I would move to docerization if time limit is viable. But this technique is</w:t>
-      </w:r>
-    </w:p>
-    <w:p>
-      <w:r>
-        <w:t>enough to run MySQL locally, although it does require manual configuration</w:t>
+        <w:t>remote URL origin and pushing to the "dev" branch in the origin URL on the remote.</w:t>
       </w:r>
     </w:p>
     <w:p/>
     <w:p>
       <w:r>
-        <w:t>14) Now I am adding the installed dependecies in requirements.txt.</w:t>
+        <w:t>19) Now creating a new Django app which is named "core", and this is going to be a modular component where my models, views, etc are going</w:t>
+      </w:r>
+    </w:p>
+    <w:p>
+      <w:r>
+        <w:t>to be stored for modularity using the command "python manage.py startapp core"</w:t>
       </w:r>
     </w:p>
     <w:p/>
     <w:p>
       <w:r>
-        <w:t>15) Create a requirements.txt using "pip freeze &gt; requirements.txt", this creates or overwrites the requirement.txt automatically,</w:t>
-      </w:r>
-    </w:p>
-    <w:p>
-      <w:r>
-        <w:t>adding the required python pacakges installed in current project enviroment (including versions) to requirements.txt</w:t>
+        <w:t>20) the in techmart/techmart/setting.py register this in INSTALLED_APPS wiht 'core'</w:t>
       </w:r>
     </w:p>
     <w:p/>
     <w:p>
       <w:r>
-        <w:t>16) now "deactivate" from the env so that we can push the current work in github, (I had created a repository beforehand)</w:t>
+        <w:t>21) Make classes for the entities provided, and currently I am only setting the foreign keys of all the tables, beacuase the other</w:t>
+      </w:r>
+    </w:p>
+    <w:p>
+      <w:r>
+        <w:t>attributes would be set up after loading the data from csv, so first make a migrations using " python manage.py makemigrations",</w:t>
+      </w:r>
+    </w:p>
+    <w:p>
+      <w:r>
+        <w:t>now the schema has been set up and models have been created and migration has been set up.</w:t>
       </w:r>
     </w:p>
     <w:p/>
     <w:p>
       <w:r>
-        <w:t>17) create a ".gitignore" so that venv, .env files, data, and similar files can be excluded from pushing into the git</w:t>
+        <w:t>22) Applying the migration to the database using "python manage.py migrate"</w:t>
       </w:r>
     </w:p>
     <w:p/>
     <w:p>
       <w:r>
+        <w:t>23) Creating directory management/commands/ because Django automatically discovers management commands by looking inside each apps</w:t>
+      </w:r>
+    </w:p>
+    <w:p>
+      <w:r>
+        <w:t>"management/commands/" folder, basically the django.core.management is Django's internal system that looks for management commands,</w:t>
+      </w:r>
+    </w:p>
+    <w:p>
+      <w:r>
+        <w:t>so it will find load command in core/management/commands/load.py and then execute the code inside it.</w:t>
+      </w:r>
+    </w:p>
+    <w:p/>
+    <w:p>
+      <w:r>
+        <w:t>24) Implementing Load.py file so that data can be correctly loaded and columns can be dynamically loaded into the models. But this with this</w:t>
+      </w:r>
+    </w:p>
+    <w:p>
+      <w:r>
+        <w:t>approach i ran into a problem as i got an error message like "In customers cannot find Name, email, etc ... ", and upon my research i found</w:t>
+      </w:r>
+    </w:p>
+    <w:p>
+      <w:r>
+        <w:t>out that we have to define the attributes of our models first.</w:t>
+      </w:r>
+    </w:p>
+    <w:p/>
+    <w:p>
+      <w:r>
         <w:lastRenderedPageBreak/>
-        <w:t>18) initialized git using "git init" and created a new branch named dev as "git checkout -b dev", then add by "git add .", commit, adding</w:t>
-      </w:r>
-    </w:p>
-    <w:p>
-      <w:r>
-        <w:t>remote URL origin and pushing to the "dev" branch in the origin URL on the remote.</w:t>
+        <w:t>25) so after that I reimplemented the models.py where i understood all the columns of respective datatypes, analyzed the approximate size and</w:t>
+      </w:r>
+    </w:p>
+    <w:p>
+      <w:r>
+        <w:t>datatypes of the attributes.</w:t>
       </w:r>
     </w:p>
     <w:p/>
     <w:p>
       <w:r>
-        <w:t>19) Now creating a new Django app which is named "core", and this is going to be a modular component where my models, views, etc are going</w:t>
-      </w:r>
-    </w:p>
-    <w:p>
-      <w:r>
-        <w:t>to be stored for modularity using the command "python manage.py startapp core"</w:t>
+        <w:t>26) So after setting the models, go to backend/Techmart and run "python manage.py makemigrations", to prepare migration files and detect the</w:t>
+      </w:r>
+    </w:p>
+    <w:p>
+      <w:r>
+        <w:t>changes in schema, after that applying those migrations using "python manage.py migrate"</w:t>
       </w:r>
     </w:p>
     <w:p/>
     <w:p>
       <w:r>
-        <w:t>20) the in techmart/techmart/setting.py register this in INSTALLED_APPS wiht 'core'</w:t>
+        <w:t>27) I have made my load.py completely atomic, so that if We get any error none of the changes apply, and roll back is done so that their is no</w:t>
+      </w:r>
+    </w:p>
+    <w:p>
+      <w:r>
+        <w:t>foreign key constraint and duplication (although they are handled by Django, when we give cascading flags while defining attributes), but</w:t>
+      </w:r>
+    </w:p>
+    <w:p>
+      <w:r>
+        <w:t>this atomicity is done for good practice and safety.</w:t>
       </w:r>
     </w:p>
     <w:p/>
     <w:p>
       <w:r>
-        <w:t>21) Make classes for the entities provided, and currently I am only setting the foreign keys of all the tables, beacuase the other</w:t>
-      </w:r>
-    </w:p>
-    <w:p>
-      <w:r>
-        <w:t>attributes would be set up after loading the data from csv, so first make a migrations using " python manage.py makemigrations",</w:t>
-      </w:r>
-    </w:p>
-    <w:p>
-      <w:r>
-        <w:t>now the schema has been set up and models have been created and migration has been set up.</w:t>
+        <w:t>28) the values who has a suffix of "_id" are considered Foreign keys, if they are also found in foreign key in the models of Django, because there</w:t>
+      </w:r>
+    </w:p>
+    <w:p>
+      <w:r>
+        <w:t>were some similar attributes eg "session_id", which wouldh have caused issues, in this way robustness is ensured.</w:t>
       </w:r>
     </w:p>
     <w:p/>
     <w:p>
       <w:r>
-        <w:t>22) Applying the migration to the database using "python manage.py migrate"</w:t>
+        <w:t>29) after trying to run load.py, i got an error "Certification in Customer cannot be null", so upon further inspection of the csv files i realized</w:t>
+      </w:r>
+    </w:p>
+    <w:p>
+      <w:r>
+        <w:t>that some values were empty or left blank, for eg phone in customers, warranty_months, they have been commented in models.py for reference.</w:t>
+      </w:r>
+    </w:p>
+    <w:p>
+      <w:r>
+        <w:t>These values are allowed null values and alos blank = True for them (blank allows form to left these values empty, multiple migrations are done</w:t>
+      </w:r>
+    </w:p>
+    <w:p>
+      <w:r>
+        <w:t>in attempt to cater similar null value errors</w:t>
+      </w:r>
+    </w:p>
+    <w:p>
+      <w:r>
+        <w:t>because initially null was not allowed for any value for rebustness and then I fixed the errors incrementally.</w:t>
       </w:r>
     </w:p>
     <w:p/>
     <w:p>
       <w:r>
-        <w:t>23) Creating directory management/commands/ because Django automatically discovers management commands by looking inside each apps</w:t>
-      </w:r>
-    </w:p>
-    <w:p>
-      <w:r>
-        <w:t>"management/commands/" folder, basically the django.core.management is Django's internal system that looks for management commands,</w:t>
-      </w:r>
-    </w:p>
-    <w:p>
-      <w:r>
-        <w:t>so it will find load command in core/management/commands/load.py and then execute the code inside it.</w:t>
+        <w:t>30) Timestamps in the CSV files were in multiple formats, so we parsed and normalized them into a consistent timezone-aware datetime format</w:t>
+      </w:r>
+    </w:p>
+    <w:p>
+      <w:r>
+        <w:lastRenderedPageBreak/>
+        <w:t>before storing them in the database. for eg "2025-05-14T18:44:04.302639" and "5/5/2025  8:16:30 AM" were obvserved in the csv,</w:t>
       </w:r>
     </w:p>
     <w:p/>
     <w:p>
       <w:r>
-        <w:t>24) Implementing Load.py file so that data can be correctly loaded and columns can be dynamically loaded into the models. But this with this</w:t>
-      </w:r>
-    </w:p>
-    <w:p>
-      <w:r>
-        <w:t>approach i ran into a problem as i got an error message like "In customers cannot find Name, email, etc ... ", and upon my research i found</w:t>
+        <w:t>31) After creating the databses and filling the data, test them using manage.py shell using "python manage.py shell", and then you can check for</w:t>
+      </w:r>
+    </w:p>
+    <w:p>
+      <w:r>
+        <w:t>tables in this way: you can check suppliers and other data as well, and match some of the data with respective csvs, this will ensure that</w:t>
+      </w:r>
+    </w:p>
+    <w:p>
+      <w:r>
+        <w:t>everything has been done correctly till now.</w:t>
+      </w:r>
+    </w:p>
+    <w:p>
+      <w:r>
+        <w:t>first give import command using "from core.models import Supplier, Product, Customer, Transaction"</w:t>
+      </w:r>
+    </w:p>
+    <w:p>
+      <w:r>
+        <w:t>now run all these code blocks one by one, and the data will be printed and you double check it using code blocks below</w:t>
+      </w:r>
+    </w:p>
+    <w:p>
+      <w:r>
+        <w:t># Suppliers</w:t>
+      </w:r>
+    </w:p>
+    <w:p>
+      <w:r>
+        <w:t>print("Suppliers:")</w:t>
+      </w:r>
+    </w:p>
+    <w:p>
+      <w:r>
+        <w:t>for s in Supplier.objects.all():</w:t>
+      </w:r>
+    </w:p>
+    <w:p>
+      <w:r>
+        <w:t>print(s.id, s.name)</w:t>
+      </w:r>
+    </w:p>
+    <w:p>
+      <w:r>
+        <w:t># Customers</w:t>
+      </w:r>
+    </w:p>
+    <w:p>
+      <w:r>
+        <w:t>print("\nCustomers:")</w:t>
+      </w:r>
+    </w:p>
+    <w:p>
+      <w:r>
+        <w:t>for c in Customer.objects.all():</w:t>
+      </w:r>
+    </w:p>
+    <w:p>
+      <w:r>
+        <w:t>print(f"{c.id} | {c.first_name} {c.last_name} | Email: {c.email} | Tier: {c.loyalty_tier}")</w:t>
+      </w:r>
+    </w:p>
+    <w:p>
+      <w:r>
+        <w:t># Transactions</w:t>
+      </w:r>
+    </w:p>
+    <w:p>
+      <w:r>
+        <w:t>print("\nTransactions:")</w:t>
+      </w:r>
+    </w:p>
+    <w:p>
+      <w:r>
+        <w:t>for t in Transaction.objects.all():</w:t>
+      </w:r>
+    </w:p>
+    <w:p>
+      <w:r>
+        <w:t>print(f"{t.id} | Customer: {t.customer.id} | Product: {t.product.id} | Time: {t.timestamp}")</w:t>
+      </w:r>
+    </w:p>
+    <w:p/>
+    <w:p>
+      <w:r>
+        <w:t>32) Now as I have added personal credentals in settings.py, the practice is to create a .env put credentials there</w:t>
+      </w:r>
+    </w:p>
+    <w:p>
+      <w:r>
+        <w:t>use .env variables in settings.py and also create .env.example for user reference. This secures personal</w:t>
       </w:r>
     </w:p>
     <w:p>
       <w:r>
         <w:lastRenderedPageBreak/>
-        <w:t>out that we have to define the attributes of our models first.</w:t>
+        <w:t>credentials. now changing Techmart/settings.py to use the enviroment variables using "python-dotenv" library</w:t>
+      </w:r>
+    </w:p>
+    <w:p>
+      <w:r>
+        <w:t>to load the env variables from the library. Install the library using "pip install python-dotenv" if required.</w:t>
       </w:r>
     </w:p>
     <w:p/>
     <w:p>
       <w:r>
-        <w:t>25) so after that I reimplemented the models.py where i understood all the columns of respective datatypes, analyzed the approximate size and</w:t>
-      </w:r>
-    </w:p>
-    <w:p>
-      <w:r>
-        <w:t>datatypes of the attributes.</w:t>
+        <w:t>33)  It is time to commit and push changes into the new  Database/Data-Loading-branch. to save changes that have been done till now. and create a pul request</w:t>
       </w:r>
     </w:p>
     <w:p/>
     <w:p>
       <w:r>
-        <w:t>26) So after setting the models, go to backend/Techmart and run "python manage.py makemigrations", to prepare migration files and detect the</w:t>
-      </w:r>
-    </w:p>
-    <w:p>
-      <w:r>
-        <w:t>changes in schema, after that applying those migrations using "python manage.py migrate"</w:t>
+        <w:t>34) now to create rest apis i am using Django REST framework (DRF), it will add rest_framework to our INSTALLED_APPS, our app is core.</w:t>
       </w:r>
     </w:p>
     <w:p/>
     <w:p>
       <w:r>
-        <w:t>27) I have made my load.py completely atomic, so that if We get any error none of the changes apply, and roll back is done so that their is no</w:t>
-      </w:r>
-    </w:p>
-    <w:p>
-      <w:r>
-        <w:t>foreign key constraint and duplication (although they are handled by Django, when we give cascading flags while defining attributes), but</w:t>
-      </w:r>
-    </w:p>
-    <w:p>
-      <w:r>
-        <w:t>this atomicity is done for good practice and safety.</w:t>
+        <w:t>35) Create a Serializer File in Backend/Techmart/Core and make 4 serializers to serialize the data so that we return it in json to the frontend</w:t>
+      </w:r>
+    </w:p>
+    <w:p>
+      <w:r>
+        <w:t>using fields = '__all__' just includes all fields from the model in the serializer, and serializer would be like fields = ['id', 'name', 'price' etc]</w:t>
       </w:r>
     </w:p>
     <w:p/>
     <w:p>
       <w:r>
-        <w:t>28) the values who has a suffix of "_id" are considered Foreign keys, if they are also found in foreign key in the models of Django, because there</w:t>
-      </w:r>
-    </w:p>
-    <w:p>
-      <w:r>
-        <w:t>were some similar attributes eg "session_id", which wouldh have caused issues, in this way robustness is ensured.</w:t>
+        <w:t>36) Writing API endpoints in backend/Techmart/core/views.py, Writing GET and POST commands and implemneting them and returning the responses after applying logic on</w:t>
+      </w:r>
+    </w:p>
+    <w:p>
+      <w:r>
+        <w:t>the request data after serializing them if required, and also handling business logic in this file, for eg reasonable amount validation, otherwise we throw a bad</w:t>
+      </w:r>
+    </w:p>
+    <w:p>
+      <w:r>
+        <w:t>request error with HTTP status code 400 and also checking for insufficient stock and applying other mentioned logic as well</w:t>
       </w:r>
     </w:p>
     <w:p/>
     <w:p>
       <w:r>
-        <w:t>29) after trying to run load.py, i got an error "Certification in Customer cannot be null", so upon further inspection of the csv files i realized</w:t>
-      </w:r>
-    </w:p>
-    <w:p>
-      <w:r>
-        <w:t>that some values were empty or left blank, for eg phone in customers, warranty_months, they have been commented in models.py for reference.</w:t>
-      </w:r>
-    </w:p>
-    <w:p>
-      <w:r>
-        <w:t>These values are allowed null values and alos blank = True for them (blank allows form to left these values empty, multiple migrations are done</w:t>
-      </w:r>
-    </w:p>
-    <w:p>
-      <w:r>
-        <w:t>in attempt to cater similar null value errors</w:t>
-      </w:r>
-    </w:p>
-    <w:p>
-      <w:r>
-        <w:t>because initially null was not allowed for any value for rebustness and then I fixed the errors incrementally.</w:t>
+        <w:t>37) Add a file urls.py in core where we define URL patterns specific to the app, and call specific views relating to the provided URL, it is like our app's own internal</w:t>
+      </w:r>
+    </w:p>
+    <w:p>
+      <w:r>
+        <w:t>routing table, it maps local routes to their corresponding view functions</w:t>
       </w:r>
     </w:p>
     <w:p/>
     <w:p>
       <w:r>
-        <w:t>30) Timestamps in the CSV files were in multiple formats, so we parsed and normalized them into a consistent timezone-aware datetime format</w:t>
-      </w:r>
-    </w:p>
-    <w:p>
-      <w:r>
-        <w:t>before storing them in the database. for eg "2025-05-14T18:44:04.302639" and "5/5/2025  8:16:30 AM" were obvserved in the csv,</w:t>
+        <w:t>38) Now include these URLS in Techmart/urls.py, using inclue library so that our Techmart projects use our app's (core) URLS.</w:t>
       </w:r>
     </w:p>
     <w:p/>
     <w:p>
       <w:r>
-        <w:t>31) After creating the databses and filling the data, test them using manage.py shell using "python manage.py shell", and then you can check for</w:t>
-      </w:r>
-    </w:p>
-    <w:p>
-      <w:r>
-        <w:t>tables in this way: you can check suppliers and other data as well, and match some of the data with respective csvs, this will ensure that</w:t>
-      </w:r>
-    </w:p>
-    <w:p>
-      <w:r>
-        <w:t>everything has been done correctly till now.</w:t>
-      </w:r>
-    </w:p>
-    <w:p>
-      <w:r>
-        <w:t>first give import command using "from core.models import Supplier, Product, Customer, Transaction"</w:t>
-      </w:r>
-    </w:p>
-    <w:p>
-      <w:r>
-        <w:t>now run all these code blocks one by one, and the data will be printed and you double check it using code blocks below</w:t>
-      </w:r>
-    </w:p>
-    <w:p>
-      <w:r>
-        <w:t># Suppliers</w:t>
-      </w:r>
-    </w:p>
-    <w:p>
-      <w:r>
-        <w:t>print("Suppliers:")</w:t>
-      </w:r>
-    </w:p>
-    <w:p>
-      <w:r>
-        <w:t>for s in Supplier.objects.all():</w:t>
-      </w:r>
-    </w:p>
-    <w:p>
-      <w:r>
-        <w:t>print(s.id, s.name)</w:t>
-      </w:r>
-    </w:p>
-    <w:p>
-      <w:r>
-        <w:t># Customers</w:t>
-      </w:r>
-    </w:p>
-    <w:p>
-      <w:r>
-        <w:t>print("\nCustomers:")</w:t>
-      </w:r>
-    </w:p>
-    <w:p>
-      <w:r>
-        <w:t>for c in Customer.objects.all():</w:t>
-      </w:r>
-    </w:p>
-    <w:p>
-      <w:r>
-        <w:t>print(f"{c.id} | {c.first_name} {c.last_name} | Email: {c.email} | Tier: {c.loyalty_tier}")</w:t>
-      </w:r>
-    </w:p>
-    <w:p>
-      <w:r>
-        <w:t># Transactions</w:t>
-      </w:r>
-    </w:p>
-    <w:p>
-      <w:r>
-        <w:t>print("\nTransactions:")</w:t>
-      </w:r>
-    </w:p>
-    <w:p>
-      <w:r>
-        <w:t>for t in Transaction.objects.all():</w:t>
-      </w:r>
-    </w:p>
-    <w:p>
-      <w:r>
-        <w:t>print(f"{t.id} | Customer: {t.customer.id} | Product: {t.product.id} | Time: {t.timestamp}")</w:t>
+        <w:lastRenderedPageBreak/>
+        <w:t>39) Now run the server using "python manage.py runserver", and go to the URL provided by the server and go to some api endpoints like "http://127.0.0.1:8000/api/dashboard/overview",</w:t>
+      </w:r>
+    </w:p>
+    <w:p>
+      <w:r>
+        <w:t>"http://127.0.0.1:8000/api/inventory/low-stock", to check whether the backend is running fine</w:t>
       </w:r>
     </w:p>
     <w:p/>
     <w:p>
       <w:r>
+        <w:t>40) Add, commit these changes to Git before moving forward</w:t>
+      </w:r>
+    </w:p>
+    <w:p/>
+    <w:p>
+      <w:r>
+        <w:t>41) now go to root directory and run the command "npm create vite@latest frontend -- --template react-ts" and this will prompt for the frameworl, i choose react and then</w:t>
+      </w:r>
+    </w:p>
+    <w:p>
+      <w:r>
+        <w:t>typescript.</w:t>
+      </w:r>
+    </w:p>
+    <w:p/>
+    <w:p>
+      <w:r>
+        <w:t>42) now follow the commands shown on the terminal like cd frontend, npm install and then npm run dev</w:t>
+      </w:r>
+    </w:p>
+    <w:p/>
+    <w:p>
+      <w:r>
+        <w:t>43) Installed Material-UI and related libraries for UI components and DataGrid:</w:t>
+      </w:r>
+    </w:p>
+    <w:p>
+      <w:r>
+        <w:t>npm install @mui/material @emotion/react @emotion/styled @mui/x-data-grid recharts</w:t>
+      </w:r>
+    </w:p>
+    <w:p/>
+    <w:p>
+      <w:r>
+        <w:t>44) Set up the main dashboard layout in Dashboard.tsx using MUI’s Grid and Container for a responsive structure.</w:t>
+      </w:r>
+    </w:p>
+    <w:p/>
+    <w:p>
+      <w:r>
+        <w:t>45) Created a Header component to display summary metrics fetched from the backend.</w:t>
+      </w:r>
+    </w:p>
+    <w:p/>
+    <w:p>
+      <w:r>
+        <w:t>46) Built a DashboardFilters component to allow users to select date range, category, and segment, updating the filters state.</w:t>
+      </w:r>
+    </w:p>
+    <w:p/>
+    <w:p>
+      <w:r>
+        <w:t>47) Developed the SalesChart component using Recharts to visualize sales data, updating on filter change.</w:t>
+      </w:r>
+    </w:p>
+    <w:p/>
+    <w:p>
+      <w:r>
         <w:lastRenderedPageBreak/>
-        <w:t>32) Now as I have added personal credentals in settings.py, the practice is to create a .env put credentials there</w:t>
-      </w:r>
-    </w:p>
-    <w:p>
-      <w:r>
-        <w:t>use .env variables in settings.py and also create .env.example for user reference. This secures personal</w:t>
-      </w:r>
-    </w:p>
-    <w:p>
-      <w:r>
-        <w:t>credentials. now changing Techmart/settings.py to use the enviroment variables using "python-dotenv" library</w:t>
-      </w:r>
-    </w:p>
-    <w:p>
-      <w:r>
-        <w:t>to load the env variables from the library. Install the library using "pip install python-dotenv" if required.</w:t>
+        <w:t>48) Implemented LowStockProductsWidget to display low stock products in a DataGrid, with search and CSV export.</w:t>
       </w:r>
     </w:p>
     <w:p/>
     <w:p>
       <w:r>
-        <w:t>33)  It is time to commit and push changes into the new  Database/Data-Loading-branch. to save changes that have been done till now. and create a pul request</w:t>
+        <w:t>51) Built TransactionsFeed to show suspicious transactions in a DataGrid, with search and a modal for transaction details.</w:t>
       </w:r>
     </w:p>
     <w:p/>
     <w:p>
       <w:r>
-        <w:t>34) now to create rest apis i am using Django REST framework (DRF), it will add rest_framework to our INSTALLED_APPS, our app is core.</w:t>
+        <w:t>52) Created TransactionModal to display detailed transaction info in a dialog when a row is clicked.</w:t>
       </w:r>
     </w:p>
     <w:p/>
     <w:p>
       <w:r>
-        <w:t>35) Create a Serializer File in Backend/Techmart/Core and make 4 serializers to serialize the data so that we return it in json to the frontend</w:t>
-      </w:r>
-    </w:p>
-    <w:p>
-      <w:r>
-        <w:t>using fields = '__all__' just includes all fields from the model in the serializer, and serializer would be like fields = ['id', 'name', 'price' etc]</w:t>
+        <w:t>53) Fixed TypeScript errors by defining explicit row types for DataGrid and ensuring all props and API data are correctly typed.</w:t>
       </w:r>
     </w:p>
     <w:p/>
     <w:p>
       <w:r>
-        <w:t>36) Writing API endpoints in backend/Techmart/core/views.py, Writing GET and POST commands and implemneting them and returning the responses after applying logic on</w:t>
-      </w:r>
-    </w:p>
-    <w:p>
-      <w:r>
-        <w:t>the request data after serializing them if required, and also handling business logic in this file, for eg reasonable amount validation, otherwise we throw a bad</w:t>
-      </w:r>
-    </w:p>
-    <w:p>
-      <w:r>
-        <w:t>request error with HTTP status code 400 and also checking for insufficient stock and applying other mentioned logic as well</w:t>
+        <w:t>54) Added loading and error states to widgets using MUI CircularProgress and Alert for better user feedback.</w:t>
       </w:r>
     </w:p>
     <w:p/>
     <w:p>
       <w:r>
-        <w:t>37) Add a file urls.py in core where we define URL patterns specific to the app, and call specific views relating to the provided URL, it is like our app's own internal</w:t>
-      </w:r>
-    </w:p>
-    <w:p>
-      <w:r>
-        <w:t>routing table, it maps local routes to their corresponding view functions</w:t>
+        <w:t>55) Implemented AlertsContext and GlobalSnackbar to show notifications for errors and important actions across the app.</w:t>
       </w:r>
     </w:p>
     <w:p/>
     <w:p>
       <w:r>
+        <w:t>56) Organized API calls into separate files for maintainability and reusability.</w:t>
+      </w:r>
+    </w:p>
+    <w:p/>
+    <w:p>
+      <w:r>
+        <w:t>57) Ensured all components are modular and reusable by passing filters and data as props, and using context for shared state.</w:t>
+      </w:r>
+    </w:p>
+    <w:p/>
+    <w:p>
+      <w:r>
+        <w:t>58) Maintained a responsive layout using MUI Grid breakpoints for usability on all devices.</w:t>
+      </w:r>
+    </w:p>
+    <w:p/>
+    <w:p>
+      <w:r>
+        <w:t>59) CSV export are done for the Low Stock Products table, allowing users to download all filtered products with their name, stock, and status.</w:t>
+      </w:r>
+    </w:p>
+    <w:p/>
+    <w:p>
+      <w:r>
+        <w:t>60) Creating a post command (I forgot to do earlier), and checking in the databse using python manage.py shell method as mentioned in point 31, and then seeing the</w:t>
+      </w:r>
+    </w:p>
+    <w:p>
+      <w:r>
         <w:lastRenderedPageBreak/>
-        <w:t>38) Now include these URLS in Techmart/urls.py, using inclue library so that our Techmart projects use our app's (core) URLS.</w:t>
-      </w:r>
-    </w:p>
-    <w:p/>
-    <w:p>
-      <w:r>
-        <w:t>39) Now run the server using "python manage.py runserver", and go to the URL provided by the server and go to some api endpoints like "http://127.0.0.1:8000/api/dashboard/overview",</w:t>
-      </w:r>
-    </w:p>
-    <w:p>
-      <w:r>
-        <w:t>"http://127.0.0.1:8000/api/inventory/low-stock", to check whether the backend is running fine</w:t>
-      </w:r>
-    </w:p>
-    <w:p/>
-    <w:p>
-      <w:r>
-        <w:t>40) Add, commit these changes to Git before moving forward</w:t>
-      </w:r>
-    </w:p>
-    <w:p/>
-    <w:p>
-      <w:r>
-        <w:t>41) now go to root directory and run the command "npm create vite@latest frontend -- --template react-ts" and this will prompt for the frameworl, i choose react and then</w:t>
-      </w:r>
-    </w:p>
-    <w:p>
-      <w:r>
-        <w:t>typescript.</w:t>
-      </w:r>
-    </w:p>
-    <w:p/>
-    <w:p>
-      <w:r>
-        <w:t>42) now follow the commands shown on the terminal like cd frontend, npm install and then npm run dev</w:t>
-      </w:r>
-    </w:p>
-    <w:p/>
-    <w:p>
-      <w:r>
-        <w:t>43) Installed Material-UI and related libraries for UI components and DataGrid:</w:t>
-      </w:r>
-    </w:p>
-    <w:p>
-      <w:r>
-        <w:t>npm install @mui/material @emotion/react @emotion/styled @mui/x-data-grid recharts</w:t>
-      </w:r>
-    </w:p>
-    <w:p/>
-    <w:p>
-      <w:r>
-        <w:t>44) Set up the main dashboard layout in Dashboard.tsx using MUI’s Grid and Container for a responsive structure.</w:t>
-      </w:r>
-    </w:p>
-    <w:p/>
-    <w:p>
-      <w:r>
-        <w:t>45) Created a Header component to display summary metrics fetched from the backend.</w:t>
-      </w:r>
-    </w:p>
-    <w:p/>
-    <w:p>
-      <w:r>
-        <w:t>46) Built a DashboardFilters component to allow users to select date range, category, and segment, updating the filters state.</w:t>
-      </w:r>
-    </w:p>
-    <w:p/>
-    <w:p>
-      <w:r>
-        <w:lastRenderedPageBreak/>
-        <w:t>47) Developed the SalesChart component using Recharts to visualize sales data, updating on filter change.</w:t>
-      </w:r>
-    </w:p>
-    <w:p/>
-    <w:p>
-      <w:r>
-        <w:t>48) Implemented LowStockProductsWidget to display low stock products in a DataGrid, with search and CSV export.</w:t>
-      </w:r>
-    </w:p>
-    <w:p/>
-    <w:p>
-      <w:r>
-        <w:t>51) Built TransactionsFeed to show suspicious transactions in a DataGrid, with search and a modal for transaction details.</w:t>
-      </w:r>
-    </w:p>
-    <w:p/>
-    <w:p>
-      <w:r>
-        <w:t>52) Created TransactionModal to display detailed transaction info in a dialog when a row is clicked.</w:t>
-      </w:r>
-    </w:p>
-    <w:p/>
-    <w:p>
-      <w:r>
-        <w:t>53) Fixed TypeScript errors by defining explicit row types for DataGrid and ensuring all props and API data are correctly typed.</w:t>
-      </w:r>
-    </w:p>
-    <w:p/>
-    <w:p>
-      <w:r>
-        <w:t>54) Added loading and error states to widgets using MUI CircularProgress and Alert for better user feedback.</w:t>
-      </w:r>
-    </w:p>
-    <w:p/>
-    <w:p>
-      <w:r>
-        <w:t>55) Implemented AlertsContext and GlobalSnackbar to show notifications for errors and important actions across the app.</w:t>
-      </w:r>
-    </w:p>
-    <w:p/>
-    <w:p>
-      <w:r>
-        <w:t>56) Organized API calls into separate files for maintainability and reusability.</w:t>
-      </w:r>
-    </w:p>
-    <w:p/>
-    <w:p>
-      <w:r>
-        <w:t>57) Ensured all components are modular and reusable by passing filters and data as props, and using context for shared state.</w:t>
-      </w:r>
-    </w:p>
-    <w:p/>
-    <w:p>
-      <w:r>
-        <w:t>58) Maintained a responsive layout using MUI Grid breakpoints for usability on all devices.</w:t>
-      </w:r>
-    </w:p>
-    <w:p/>
-    <w:p>
-      <w:r>
-        <w:t>59) CSV export are done for the Low Stock Products table, allowing users to download all filtered products with their name, stock, and status.</w:t>
-      </w:r>
-    </w:p>
-    <w:p/>
-    <w:p>
-      <w:r>
-        <w:t>60) Creating a post command (I forgot to do earlier), and checking in the databse using python manage.py shell method as mentioned in point 31, and then seeing the</w:t>
-      </w:r>
-    </w:p>
-    <w:p>
-      <w:r>
         <w:t>updated change in the database indicates correct transaction, other enpoints were somehow checked using the frontend calls after displaying in the frontend</w:t>
       </w:r>
     </w:p>
@@ -814,10 +818,17 @@
     </w:p>
     <w:p>
       <w:r>
-        <w:t>64) After Analysis I have decided to choose Task D for as my Challange Task, And Firstly after analyzing the views file I am analysing which columns</w:t>
-      </w:r>
-    </w:p>
-    <w:p>
+        <w:t xml:space="preserve">64) After Analysis I have decided to choose Task D for as my Challange Task, And Firstly after analyzing the views file I am </w:t>
+      </w:r>
+      <w:r>
+        <w:t>analyzing</w:t>
+      </w:r>
+      <w:r>
+        <w:t xml:space="preserve"> which columns</w:t>
+      </w:r>
+      <w:r>
+        <w:t xml:space="preserve"> </w:t>
+      </w:r>
       <w:r>
         <w:t>are used the most in queries, and creating indexes on them</w:t>
       </w:r>
@@ -843,7 +854,6 @@
     <w:p/>
     <w:p>
       <w:r>
-        <w:lastRenderedPageBreak/>
         <w:t>68) Created indexes on the category and supplier fields in the Product model to enhance query efficiency for category and supplier-based product lookups.</w:t>
       </w:r>
     </w:p>
@@ -858,23 +868,56 @@
       <w:r>
         <w:t>70) Now downloading redis server from the following link because Django's cahce framework is just a cient and real server redis is needed. Download from the link</w:t>
       </w:r>
-    </w:p>
-    <w:p>
-      <w:r>
-        <w:t>"https://github.com/microsoftarchive/redis/releases", and then download the latest version however i downloaded "Redis-x64-3.0.504.zip". after that unzip this</w:t>
-      </w:r>
-    </w:p>
-    <w:p>
+      <w:r>
+        <w:t xml:space="preserve"> </w:t>
+      </w:r>
+      <w:hyperlink r:id="rId6" w:history="1">
+        <w:r>
+          <w:rPr>
+            <w:rStyle w:val="Hyperlink"/>
+          </w:rPr>
+          <w:t>https://github.com/microsoftarchive</w:t>
+        </w:r>
+        <w:r>
+          <w:rPr>
+            <w:rStyle w:val="Hyperlink"/>
+          </w:rPr>
+          <w:t>/</w:t>
+        </w:r>
+        <w:r>
+          <w:rPr>
+            <w:rStyle w:val="Hyperlink"/>
+          </w:rPr>
+          <w:t>redis/releases</w:t>
+        </w:r>
+      </w:hyperlink>
+      <w:r>
+        <w:t xml:space="preserve"> </w:t>
+      </w:r>
+      <w:r>
+        <w:t>, and then download the latest version however i downloaded "Redis-x64-3.0.504.zip". after that unzip this</w:t>
+      </w:r>
+      <w:r>
+        <w:t xml:space="preserve"> </w:t>
+      </w:r>
       <w:r>
         <w:t>into a folder like C:\Redis and then "cd C:\Redis" and after that if you are using powershell use ".\redis-server.exe" to start the server and you will</w:t>
       </w:r>
-    </w:p>
-    <w:p>
-      <w:r>
-        <w:t>see the window which prompt you to select enter and then you will see the message "Server started, Redis version 3.0.504" and it will aslo say</w:t>
-      </w:r>
-    </w:p>
-    <w:p>
+      <w:r>
+        <w:t xml:space="preserve"> </w:t>
+      </w:r>
+      <w:r>
+        <w:t xml:space="preserve">see the window which prompt you to select enter and then you will see the message "Server started, Redis version 3.0.504" and it will </w:t>
+      </w:r>
+      <w:r>
+        <w:t>also</w:t>
+      </w:r>
+      <w:r>
+        <w:t xml:space="preserve"> say</w:t>
+      </w:r>
+      <w:r>
+        <w:t xml:space="preserve"> </w:t>
+      </w:r>
       <w:r>
         <w:t>"The server is now ready to accept connections on port 6379"</w:t>
       </w:r>
@@ -884,20 +927,41 @@
       <w:r>
         <w:t>71) Now apply the caching in the areas in views.py where data is frequently accessed and set the time limit according to how fequrent the data is being accessed, if it</w:t>
       </w:r>
-    </w:p>
-    <w:p>
+      <w:r>
+        <w:t xml:space="preserve"> </w:t>
+      </w:r>
       <w:r>
         <w:t>is less frequent than we can increase the time limit to be more than 1, but 1 minute is hsort enough that users see upto date data but long enough to avoid hitting</w:t>
       </w:r>
-    </w:p>
-    <w:p>
+      <w:r>
+        <w:t xml:space="preserve"> </w:t>
+      </w:r>
       <w:r>
         <w:t>the database for every request. And for most dashboards delay of upto 1 minute is acceptable, if a lot of users open the dashboard at once then cache serves them</w:t>
       </w:r>
-    </w:p>
-    <w:p>
+      <w:r>
+        <w:t xml:space="preserve"> </w:t>
+      </w:r>
       <w:r>
         <w:t>all quickly, reducing database/server load.</w:t>
+      </w:r>
+    </w:p>
+    <w:p/>
+    <w:p>
+      <w:r>
+        <w:t xml:space="preserve">72) Now for connection pooling go to backend/techmart/techmart/settings.py and in the under DATABASES section write ‘CONN_MAX_AGE’: 300, which enables persistent connections for 5 minutes. </w:t>
+      </w:r>
+      <w:r>
+        <w:t>So,</w:t>
+      </w:r>
+      <w:r>
+        <w:t xml:space="preserve"> connections can be reused instead of opening a new one for every request.</w:t>
+      </w:r>
+    </w:p>
+    <w:p/>
+    <w:p>
+      <w:r>
+        <w:t>73). select_related(‘customer’) perform a SQL join and fetches all needed customer data in one go, greatly improving performance when accessing related fields in serializers. This is the main query optimization needed for my codebase.</w:t>
       </w:r>
     </w:p>
     <w:sectPr>
@@ -12493,6 +12557,41 @@
       </w:tcPr>
     </w:tblStylePr>
   </w:style>
+  <w:style w:type="character" w:styleId="Hyperlink">
+    <w:name w:val="Hyperlink"/>
+    <w:basedOn w:val="DefaultParagraphFont"/>
+    <w:uiPriority w:val="99"/>
+    <w:unhideWhenUsed/>
+    <w:rsid w:val="0047314B"/>
+    <w:rPr>
+      <w:color w:val="0000FF" w:themeColor="hyperlink"/>
+      <w:u w:val="single"/>
+    </w:rPr>
+  </w:style>
+  <w:style w:type="character" w:styleId="UnresolvedMention">
+    <w:name w:val="Unresolved Mention"/>
+    <w:basedOn w:val="DefaultParagraphFont"/>
+    <w:uiPriority w:val="99"/>
+    <w:semiHidden/>
+    <w:unhideWhenUsed/>
+    <w:rsid w:val="0047314B"/>
+    <w:rPr>
+      <w:color w:val="605E5C"/>
+      <w:shd w:val="clear" w:color="auto" w:fill="E1DFDD"/>
+    </w:rPr>
+  </w:style>
+  <w:style w:type="character" w:styleId="FollowedHyperlink">
+    <w:name w:val="FollowedHyperlink"/>
+    <w:basedOn w:val="DefaultParagraphFont"/>
+    <w:uiPriority w:val="99"/>
+    <w:semiHidden/>
+    <w:unhideWhenUsed/>
+    <w:rsid w:val="0047314B"/>
+    <w:rPr>
+      <w:color w:val="800080" w:themeColor="followedHyperlink"/>
+      <w:u w:val="single"/>
+    </w:rPr>
+  </w:style>
 </w:styles>
 </file>
 

</xml_diff>